<commit_message>
new time series forecasting technique added
</commit_message>
<xml_diff>
--- a/Usecase.docx
+++ b/Usecase.docx
@@ -40,28 +40,12 @@
     </w:p>
     <w:p>
       <w:r>
-        <w:t xml:space="preserve">The Gent-Terneuzen canal connects the port of Ghent to the </w:t>
-      </w:r>
-      <w:proofErr w:type="spellStart"/>
-      <w:r>
-        <w:t>Westerschelde</w:t>
-      </w:r>
-      <w:proofErr w:type="spellEnd"/>
-      <w:r>
-        <w:t xml:space="preserve"> estuary in the Netherlands. Salt water from the North Sea can push inland — a process known as salt intrusion. Industrial partners along the canal are sensitive to elevated salinity levels.</w:t>
-      </w:r>
-    </w:p>
-    <w:p>
-      <w:r>
-        <w:t xml:space="preserve">Conductivity is the primary proxy for salinity: the more dissolved ions (largely salt) in the water, the higher the conductivity. VITO operates a network of sensors along the canal that </w:t>
-      </w:r>
-      <w:proofErr w:type="gramStart"/>
-      <w:r>
-        <w:t>publish</w:t>
-      </w:r>
-      <w:proofErr w:type="gramEnd"/>
-      <w:r>
-        <w:t xml:space="preserve"> live readings through the waterinfo.be.</w:t>
+        <w:t>The Gent-Terneuzen canal connects the port of Ghent to the Westerschelde estuary in the Netherlands. Salt water from the North Sea can push inland — a process known as salt intrusion. Industrial partners along the canal are sensitive to elevated salinity levels.</w:t>
+      </w:r>
+    </w:p>
+    <w:p>
+      <w:r>
+        <w:t>Conductivity is the primary proxy for salinity: the more dissolved ions (largely salt) in the water, the higher the conductivity. VITO operates a network of sensors along the canal that publish live readings through the waterinfo.be.</w:t>
       </w:r>
     </w:p>
     <w:p>
@@ -257,7 +241,6 @@
                 <w:szCs w:val="20"/>
               </w:rPr>
             </w:pPr>
-            <w:proofErr w:type="spellStart"/>
             <w:r>
               <w:rPr>
                 <w:sz w:val="20"/>
@@ -265,7 +248,13 @@
               </w:rPr>
               <w:t>Autrichehaven</w:t>
             </w:r>
-            <w:proofErr w:type="spellEnd"/>
+            <w:r>
+              <w:rPr>
+                <w:sz w:val="20"/>
+                <w:szCs w:val="20"/>
+              </w:rPr>
+              <w:t xml:space="preserve"> (Westdorpe)</w:t>
+            </w:r>
           </w:p>
         </w:tc>
         <w:tc>
@@ -412,7 +401,6 @@
                 <w:szCs w:val="20"/>
               </w:rPr>
             </w:pPr>
-            <w:proofErr w:type="spellStart"/>
             <w:r>
               <w:rPr>
                 <w:sz w:val="20"/>
@@ -420,7 +408,27 @@
               </w:rPr>
               <w:t>Grootdok</w:t>
             </w:r>
-            <w:proofErr w:type="spellEnd"/>
+            <w:r>
+              <w:rPr>
+                <w:sz w:val="20"/>
+                <w:szCs w:val="20"/>
+              </w:rPr>
+              <w:t xml:space="preserve"> (G</w:t>
+            </w:r>
+            <w:r>
+              <w:rPr>
+                <w:sz w:val="20"/>
+                <w:szCs w:val="20"/>
+              </w:rPr>
+              <w:t>h</w:t>
+            </w:r>
+            <w:r>
+              <w:rPr>
+                <w:sz w:val="20"/>
+                <w:szCs w:val="20"/>
+              </w:rPr>
+              <w:t>ent)</w:t>
+            </w:r>
           </w:p>
         </w:tc>
         <w:tc>
@@ -559,7 +567,6 @@
                 <w:szCs w:val="20"/>
               </w:rPr>
             </w:pPr>
-            <w:proofErr w:type="spellStart"/>
             <w:r>
               <w:rPr>
                 <w:sz w:val="20"/>
@@ -567,7 +574,13 @@
               </w:rPr>
               <w:t>Zevenaarshaven</w:t>
             </w:r>
-            <w:proofErr w:type="spellEnd"/>
+            <w:r>
+              <w:rPr>
+                <w:sz w:val="20"/>
+                <w:szCs w:val="20"/>
+              </w:rPr>
+              <w:t xml:space="preserve"> (Terneuzen)</w:t>
+            </w:r>
           </w:p>
         </w:tc>
         <w:tc>
@@ -706,7 +719,6 @@
                 <w:szCs w:val="20"/>
               </w:rPr>
             </w:pPr>
-            <w:proofErr w:type="spellStart"/>
             <w:r>
               <w:rPr>
                 <w:sz w:val="20"/>
@@ -714,7 +726,27 @@
               </w:rPr>
               <w:t>Rodenhuizedok</w:t>
             </w:r>
-            <w:proofErr w:type="spellEnd"/>
+            <w:r>
+              <w:rPr>
+                <w:sz w:val="20"/>
+                <w:szCs w:val="20"/>
+              </w:rPr>
+              <w:t xml:space="preserve"> (G</w:t>
+            </w:r>
+            <w:r>
+              <w:rPr>
+                <w:sz w:val="20"/>
+                <w:szCs w:val="20"/>
+              </w:rPr>
+              <w:t>h</w:t>
+            </w:r>
+            <w:r>
+              <w:rPr>
+                <w:sz w:val="20"/>
+                <w:szCs w:val="20"/>
+              </w:rPr>
+              <w:t>ent)</w:t>
+            </w:r>
           </w:p>
         </w:tc>
         <w:tc>
@@ -914,11 +946,9 @@
       <w:pPr>
         <w:pStyle w:val="Heading1"/>
       </w:pPr>
-      <w:proofErr w:type="spellStart"/>
       <w:r>
         <w:t>Notes</w:t>
       </w:r>
-      <w:proofErr w:type="spellEnd"/>
     </w:p>
     <w:p>
       <w:pPr>
@@ -926,103 +956,11 @@
           <w:lang w:val="nl-BE"/>
         </w:rPr>
       </w:pPr>
-      <w:proofErr w:type="spellStart"/>
       <w:r>
         <w:rPr>
           <w:lang w:val="nl-BE"/>
         </w:rPr>
-        <w:t>Canals</w:t>
-      </w:r>
-      <w:proofErr w:type="spellEnd"/>
-      <w:r>
-        <w:rPr>
-          <w:lang w:val="nl-BE"/>
-        </w:rPr>
-        <w:t xml:space="preserve"> </w:t>
-      </w:r>
-      <w:proofErr w:type="spellStart"/>
-      <w:r>
-        <w:rPr>
-          <w:lang w:val="nl-BE"/>
-        </w:rPr>
-        <w:t>often</w:t>
-      </w:r>
-      <w:proofErr w:type="spellEnd"/>
-      <w:r>
-        <w:rPr>
-          <w:lang w:val="nl-BE"/>
-        </w:rPr>
-        <w:t xml:space="preserve"> have "lag." </w:t>
-      </w:r>
-      <w:proofErr w:type="spellStart"/>
-      <w:r>
-        <w:rPr>
-          <w:lang w:val="nl-BE"/>
-        </w:rPr>
-        <w:t>If</w:t>
-      </w:r>
-      <w:proofErr w:type="spellEnd"/>
-      <w:r>
-        <w:rPr>
-          <w:lang w:val="nl-BE"/>
-        </w:rPr>
-        <w:t xml:space="preserve"> Sensor 1 is upstream </w:t>
-      </w:r>
-      <w:proofErr w:type="spellStart"/>
-      <w:r>
-        <w:rPr>
-          <w:lang w:val="nl-BE"/>
-        </w:rPr>
-        <w:t>and</w:t>
-      </w:r>
-      <w:proofErr w:type="spellEnd"/>
-      <w:r>
-        <w:rPr>
-          <w:lang w:val="nl-BE"/>
-        </w:rPr>
-        <w:t xml:space="preserve"> Sensor 2 is downstream, </w:t>
-      </w:r>
-      <w:proofErr w:type="spellStart"/>
-      <w:r>
-        <w:rPr>
-          <w:lang w:val="nl-BE"/>
-        </w:rPr>
-        <w:t>the</w:t>
-      </w:r>
-      <w:proofErr w:type="spellEnd"/>
-      <w:r>
-        <w:rPr>
-          <w:lang w:val="nl-BE"/>
-        </w:rPr>
-        <w:t xml:space="preserve"> water takes time </w:t>
-      </w:r>
-      <w:proofErr w:type="spellStart"/>
-      <w:r>
-        <w:rPr>
-          <w:lang w:val="nl-BE"/>
-        </w:rPr>
-        <w:t>to</w:t>
-      </w:r>
-      <w:proofErr w:type="spellEnd"/>
-      <w:r>
-        <w:rPr>
-          <w:lang w:val="nl-BE"/>
-        </w:rPr>
-        <w:t xml:space="preserve"> </w:t>
-      </w:r>
-      <w:proofErr w:type="spellStart"/>
-      <w:r>
-        <w:rPr>
-          <w:lang w:val="nl-BE"/>
-        </w:rPr>
-        <w:t>travel</w:t>
-      </w:r>
-      <w:proofErr w:type="spellEnd"/>
-      <w:r>
-        <w:rPr>
-          <w:lang w:val="nl-BE"/>
-        </w:rPr>
-        <w:t>.</w:t>
+        <w:t>Canals often have "lag." If Sensor 1 is upstream and Sensor 2 is downstream, the water takes time to travel.</w:t>
       </w:r>
     </w:p>
     <w:p>
@@ -1036,6 +974,7 @@
         <w:rPr>
           <w:lang w:val="en-US"/>
         </w:rPr>
+        <w:lastRenderedPageBreak/>
         <w:t>Time series analysis techniques</w:t>
       </w:r>
     </w:p>
@@ -1055,20 +994,11 @@
     </w:p>
     <w:p>
       <w:r>
-        <w:t xml:space="preserve">Goal: predict next reading based on </w:t>
-      </w:r>
-      <w:proofErr w:type="gramStart"/>
-      <w:r>
-        <w:t>historic</w:t>
-      </w:r>
-      <w:proofErr w:type="gramEnd"/>
-      <w:r>
-        <w:t xml:space="preserve"> data</w:t>
-      </w:r>
-    </w:p>
-    <w:p>
-      <w:r>
-        <w:lastRenderedPageBreak/>
+        <w:t>Goal: predict next reading based on historic data</w:t>
+      </w:r>
+    </w:p>
+    <w:p>
+      <w:r>
         <w:t>The model tracks the general upward trend well from April through early September — the orange (predicted) closely follows the blue (actual) during this period. That's a good sign for the middle of the test window.</w:t>
       </w:r>
     </w:p>
@@ -1079,29 +1009,16 @@
     </w:p>
     <w:p>
       <w:r>
-        <w:t xml:space="preserve">There are two sudden drops in the actual </w:t>
-      </w:r>
-      <w:proofErr w:type="gramStart"/>
-      <w:r>
-        <w:t>signal —</w:t>
-      </w:r>
-      <w:proofErr w:type="gramEnd"/>
-      <w:r>
-        <w:t xml:space="preserve"> one around early August (down to ~3,500) and one around late September/early October (down to ~10,000). The model misses </w:t>
-      </w:r>
-      <w:proofErr w:type="gramStart"/>
-      <w:r>
-        <w:t>both of them</w:t>
-      </w:r>
-      <w:proofErr w:type="gramEnd"/>
-      <w:r>
-        <w:t xml:space="preserve"> almost entirely. These are almost certainly real anomalies — sensor faults, lock operations, or measurement errors on the canal </w:t>
-      </w:r>
-    </w:p>
-    <w:p>
-      <w:r>
+        <w:t xml:space="preserve">There are two sudden drops in the actual signal — one around early August (down to ~3,500) and one around late September/early October (down to ~10,000). The model misses both of them almost entirely. These are almost certainly real anomalies — sensor faults, lock operations, or measurement errors on the canal </w:t>
+      </w:r>
+    </w:p>
+    <w:p>
+      <w:r>
+        <w:rPr>
+          <w:noProof/>
+        </w:rPr>
         <w:drawing>
-          <wp:inline distT="0" distB="0" distL="0" distR="0" wp14:anchorId="4A647E13" wp14:editId="1CEBE051">
+          <wp:inline distT="0" distB="0" distL="0" distR="0" wp14:anchorId="4A647E13" wp14:editId="7D5D5E6A">
             <wp:extent cx="5725160" cy="1605915"/>
             <wp:effectExtent l="0" t="0" r="0" b="0"/>
             <wp:docPr id="1313103864" name="Picture 1"/>
@@ -1234,6 +1151,7 @@
     </w:p>
     <w:p>
       <w:r>
+        <w:lastRenderedPageBreak/>
         <w:t>T</w:t>
       </w:r>
       <w:r>
@@ -1262,7 +1180,6 @@
     </w:p>
     <w:p>
       <w:r>
-        <w:lastRenderedPageBreak/>
         <w:t>A</w:t>
       </w:r>
       <w:r>
@@ -2027,6 +1944,7 @@
   <w:style w:type="character" w:default="1" w:styleId="DefaultParagraphFont">
     <w:name w:val="Default Paragraph Font"/>
     <w:uiPriority w:val="1"/>
+    <w:semiHidden/>
     <w:unhideWhenUsed/>
   </w:style>
   <w:style w:type="table" w:default="1" w:styleId="TableNormal">

</xml_diff>